<commit_message>
finished logic exercise 6
</commit_message>
<xml_diff>
--- a/Fall-2025/logic-for-cs/exercise-set-6.docx
+++ b/Fall-2025/logic-for-cs/exercise-set-6.docx
@@ -17,10 +17,7 @@
         <w:t>10/</w:t>
       </w:r>
       <w:r>
-        <w:t>1</w:t>
-      </w:r>
-      <w:r>
-        <w:t>4</w:t>
+        <w:t>14</w:t>
       </w:r>
       <w:r>
         <w:t>/25</w:t>
@@ -270,10 +267,7 @@
         <w:t xml:space="preserve"> ¬B</w:t>
       </w:r>
       <w:r>
-        <w:t xml:space="preserve">, </w:t>
-      </w:r>
-      <w:r>
-        <w:t xml:space="preserve"> which is in NNF.</w:t>
+        <w:t>,  which is in NNF.</w:t>
       </w:r>
       <w:r>
         <w:br/>
@@ -490,13 +484,7 @@
         <w:t>2</w:t>
       </w:r>
       <w:r>
-        <w:t xml:space="preserve"> contains </w:t>
-      </w:r>
-      <w:r>
-        <w:t xml:space="preserve">B </w:t>
-      </w:r>
-      <w:r>
-        <w:t xml:space="preserve">and </w:t>
+        <w:t xml:space="preserve"> contains B and </w:t>
       </w:r>
       <w:r>
         <w:t>¬</w:t>
@@ -581,13 +569,1419 @@
       </w:r>
       <w:r>
         <w:t xml:space="preserve"> holds true.</w:t>
-      </w:r>
-      <w:r>
-        <w:br/>
       </w:r>
     </w:p>
     <w:p/>
-    <w:p/>
+    <w:p>
+      <w:r>
+        <w:t xml:space="preserve">To show </w:t>
+      </w:r>
+      <w:r>
+        <w:t>{</w:t>
+      </w:r>
+      <w:r>
+        <w:t>(</w:t>
+      </w:r>
+      <w:r>
+        <w:t xml:space="preserve">X </w:t>
+      </w:r>
+      <w:r>
+        <w:rPr>
+          <w:rFonts w:ascii="Cambria Math" w:hAnsi="Cambria Math" w:cs="Cambria Math"/>
+        </w:rPr>
+        <w:t>∨</w:t>
+      </w:r>
+      <w:r>
+        <w:t xml:space="preserve"> Y </w:t>
+      </w:r>
+      <w:r>
+        <w:rPr>
+          <w:rFonts w:ascii="Cambria Math" w:hAnsi="Cambria Math" w:cs="Cambria Math"/>
+        </w:rPr>
+        <w:t>∨</w:t>
+      </w:r>
+      <w:r>
+        <w:t xml:space="preserve"> Z) </w:t>
+      </w:r>
+      <w:r>
+        <w:rPr>
+          <w:rFonts w:ascii="Cambria Math" w:hAnsi="Cambria Math" w:cs="Cambria Math"/>
+        </w:rPr>
+        <w:t>∧</w:t>
+      </w:r>
+      <w:r>
+        <w:t xml:space="preserve"> (X → Z) </w:t>
+      </w:r>
+      <w:r>
+        <w:rPr>
+          <w:rFonts w:ascii="Cambria Math" w:hAnsi="Cambria Math" w:cs="Cambria Math"/>
+        </w:rPr>
+        <w:t>∧</w:t>
+      </w:r>
+      <w:r>
+        <w:t xml:space="preserve"> (¬Z </w:t>
+      </w:r>
+      <w:r>
+        <w:rPr>
+          <w:rFonts w:ascii="Cambria Math" w:hAnsi="Cambria Math" w:cs="Cambria Math"/>
+        </w:rPr>
+        <w:t>∨</w:t>
+      </w:r>
+      <w:r>
+        <w:t xml:space="preserve"> Y )} |= (Y </w:t>
+      </w:r>
+      <w:r>
+        <w:rPr>
+          <w:rFonts w:ascii="Cambria Math" w:hAnsi="Cambria Math" w:cs="Cambria Math"/>
+        </w:rPr>
+        <w:t>∨</w:t>
+      </w:r>
+      <w:r>
+        <w:t xml:space="preserve"> Z)</w:t>
+      </w:r>
+      <w:r>
+        <w:t xml:space="preserve">, we need to show that </w:t>
+      </w:r>
+      <w:r>
+        <w:t>{</w:t>
+      </w:r>
+      <w:r>
+        <w:t>(</w:t>
+      </w:r>
+      <w:r>
+        <w:t xml:space="preserve">X </w:t>
+      </w:r>
+      <w:r>
+        <w:rPr>
+          <w:rFonts w:ascii="Cambria Math" w:hAnsi="Cambria Math" w:cs="Cambria Math"/>
+        </w:rPr>
+        <w:t>∨</w:t>
+      </w:r>
+      <w:r>
+        <w:t xml:space="preserve"> Y </w:t>
+      </w:r>
+      <w:r>
+        <w:rPr>
+          <w:rFonts w:ascii="Cambria Math" w:hAnsi="Cambria Math" w:cs="Cambria Math"/>
+        </w:rPr>
+        <w:t>∨</w:t>
+      </w:r>
+      <w:r>
+        <w:t xml:space="preserve"> Z) </w:t>
+      </w:r>
+      <w:r>
+        <w:rPr>
+          <w:rFonts w:ascii="Cambria Math" w:hAnsi="Cambria Math" w:cs="Cambria Math"/>
+        </w:rPr>
+        <w:t>∧</w:t>
+      </w:r>
+      <w:r>
+        <w:t xml:space="preserve"> (X → Z) </w:t>
+      </w:r>
+      <w:r>
+        <w:rPr>
+          <w:rFonts w:ascii="Cambria Math" w:hAnsi="Cambria Math" w:cs="Cambria Math"/>
+        </w:rPr>
+        <w:t>∧</w:t>
+      </w:r>
+      <w:r>
+        <w:t xml:space="preserve"> (¬Z </w:t>
+      </w:r>
+      <w:r>
+        <w:rPr>
+          <w:rFonts w:ascii="Cambria Math" w:hAnsi="Cambria Math" w:cs="Cambria Math"/>
+        </w:rPr>
+        <w:t>∨</w:t>
+      </w:r>
+      <w:r>
+        <w:t xml:space="preserve"> Y )} </w:t>
+      </w:r>
+      <w:r>
+        <w:rPr>
+          <w:rFonts w:ascii="Cambria Math" w:hAnsi="Cambria Math" w:cs="Cambria Math"/>
+        </w:rPr>
+        <w:t>∧</w:t>
+      </w:r>
+      <w:r>
+        <w:t xml:space="preserve"> ¬</w:t>
+      </w:r>
+      <w:r>
+        <w:t xml:space="preserve">(Y </w:t>
+      </w:r>
+      <w:r>
+        <w:rPr>
+          <w:rFonts w:ascii="Cambria Math" w:hAnsi="Cambria Math" w:cs="Cambria Math"/>
+        </w:rPr>
+        <w:t>∨</w:t>
+      </w:r>
+      <w:r>
+        <w:t xml:space="preserve"> Z)</w:t>
+      </w:r>
+      <w:r>
+        <w:t xml:space="preserve"> is unsatisfiable. This expression can be simplified to</w:t>
+      </w:r>
+    </w:p>
+    <w:p>
+      <w:r>
+        <w:t>(</w:t>
+      </w:r>
+      <w:r>
+        <w:t xml:space="preserve">X </w:t>
+      </w:r>
+      <w:r>
+        <w:rPr>
+          <w:rFonts w:ascii="Cambria Math" w:hAnsi="Cambria Math" w:cs="Cambria Math"/>
+        </w:rPr>
+        <w:t>∨</w:t>
+      </w:r>
+      <w:r>
+        <w:t xml:space="preserve"> Y </w:t>
+      </w:r>
+      <w:r>
+        <w:rPr>
+          <w:rFonts w:ascii="Cambria Math" w:hAnsi="Cambria Math" w:cs="Cambria Math"/>
+        </w:rPr>
+        <w:t>∨</w:t>
+      </w:r>
+      <w:r>
+        <w:t xml:space="preserve"> Z) </w:t>
+      </w:r>
+      <w:r>
+        <w:rPr>
+          <w:rFonts w:ascii="Cambria Math" w:hAnsi="Cambria Math" w:cs="Cambria Math"/>
+        </w:rPr>
+        <w:t>∧</w:t>
+      </w:r>
+      <w:r>
+        <w:t xml:space="preserve"> (¬X </w:t>
+      </w:r>
+      <w:r>
+        <w:rPr>
+          <w:rFonts w:ascii="Cambria Math" w:hAnsi="Cambria Math" w:cs="Cambria Math"/>
+        </w:rPr>
+        <w:t>∨</w:t>
+      </w:r>
+      <w:r>
+        <w:t xml:space="preserve"> Z) </w:t>
+      </w:r>
+      <w:r>
+        <w:rPr>
+          <w:rFonts w:ascii="Cambria Math" w:hAnsi="Cambria Math" w:cs="Cambria Math"/>
+        </w:rPr>
+        <w:t>∧</w:t>
+      </w:r>
+      <w:r>
+        <w:t xml:space="preserve"> (¬Z </w:t>
+      </w:r>
+      <w:r>
+        <w:rPr>
+          <w:rFonts w:ascii="Cambria Math" w:hAnsi="Cambria Math" w:cs="Cambria Math"/>
+        </w:rPr>
+        <w:t>∨</w:t>
+      </w:r>
+      <w:r>
+        <w:t xml:space="preserve"> Y ) </w:t>
+      </w:r>
+      <w:r>
+        <w:rPr>
+          <w:rFonts w:ascii="Cambria Math" w:hAnsi="Cambria Math" w:cs="Cambria Math"/>
+        </w:rPr>
+        <w:t>∧</w:t>
+      </w:r>
+      <w:r>
+        <w:t xml:space="preserve"> ¬</w:t>
+      </w:r>
+      <w:r>
+        <w:t xml:space="preserve">Y </w:t>
+      </w:r>
+      <w:r>
+        <w:rPr>
+          <w:rFonts w:ascii="Cambria Math" w:hAnsi="Cambria Math" w:cs="Cambria Math"/>
+        </w:rPr>
+        <w:t>∧</w:t>
+      </w:r>
+      <w:r>
+        <w:rPr>
+          <w:rFonts w:ascii="Cambria Math" w:hAnsi="Cambria Math" w:cs="Cambria Math"/>
+        </w:rPr>
+        <w:t xml:space="preserve"> </w:t>
+      </w:r>
+      <w:r>
+        <w:t>¬</w:t>
+      </w:r>
+      <w:r>
+        <w:t>Z</w:t>
+      </w:r>
+      <w:r>
+        <w:t xml:space="preserve">, then to which is in NNF. This means that </w:t>
+      </w:r>
+    </w:p>
+    <w:p>
+      <w:pPr>
+        <w:rPr>
+          <w:i/>
+          <w:iCs/>
+        </w:rPr>
+      </w:pPr>
+      <w:r>
+        <w:rPr>
+          <w:i/>
+          <w:iCs/>
+        </w:rPr>
+        <w:t>T</w:t>
+      </w:r>
+      <w:r>
+        <w:rPr>
+          <w:i/>
+          <w:iCs/>
+          <w:vertAlign w:val="subscript"/>
+        </w:rPr>
+        <w:t>0</w:t>
+      </w:r>
+      <w:r>
+        <w:t xml:space="preserve"> = {(</w:t>
+      </w:r>
+      <w:r>
+        <w:t xml:space="preserve">X </w:t>
+      </w:r>
+      <w:r>
+        <w:rPr>
+          <w:rFonts w:ascii="Cambria Math" w:hAnsi="Cambria Math" w:cs="Cambria Math"/>
+        </w:rPr>
+        <w:t>∨</w:t>
+      </w:r>
+      <w:r>
+        <w:t xml:space="preserve"> Y </w:t>
+      </w:r>
+      <w:r>
+        <w:rPr>
+          <w:rFonts w:ascii="Cambria Math" w:hAnsi="Cambria Math" w:cs="Cambria Math"/>
+        </w:rPr>
+        <w:t>∨</w:t>
+      </w:r>
+      <w:r>
+        <w:t xml:space="preserve"> Z)</w:t>
+      </w:r>
+      <w:r>
+        <w:t>,</w:t>
+      </w:r>
+      <w:r>
+        <w:t xml:space="preserve"> (¬X </w:t>
+      </w:r>
+      <w:r>
+        <w:rPr>
+          <w:rFonts w:ascii="Cambria Math" w:hAnsi="Cambria Math" w:cs="Cambria Math"/>
+        </w:rPr>
+        <w:t>∨</w:t>
+      </w:r>
+      <w:r>
+        <w:t xml:space="preserve"> Z)</w:t>
+      </w:r>
+      <w:r>
+        <w:t xml:space="preserve">, </w:t>
+      </w:r>
+      <w:r>
+        <w:t xml:space="preserve">(¬Z </w:t>
+      </w:r>
+      <w:r>
+        <w:rPr>
+          <w:rFonts w:ascii="Cambria Math" w:hAnsi="Cambria Math" w:cs="Cambria Math"/>
+        </w:rPr>
+        <w:t>∨</w:t>
+      </w:r>
+      <w:r>
+        <w:t xml:space="preserve"> Y )</w:t>
+      </w:r>
+      <w:r>
+        <w:t xml:space="preserve">, </w:t>
+      </w:r>
+      <w:r>
+        <w:t>¬</w:t>
+      </w:r>
+      <w:r>
+        <w:t>Y</w:t>
+      </w:r>
+      <w:r>
+        <w:t xml:space="preserve">, </w:t>
+      </w:r>
+      <w:r>
+        <w:t>¬</w:t>
+      </w:r>
+      <w:r>
+        <w:t>Z</w:t>
+      </w:r>
+      <w:r>
+        <w:t>}. Branching this from the first expression gives:</w:t>
+      </w:r>
+      <w:r>
+        <w:br/>
+      </w:r>
+      <w:r>
+        <w:rPr>
+          <w:i/>
+          <w:iCs/>
+        </w:rPr>
+        <w:t>T</w:t>
+      </w:r>
+      <w:r>
+        <w:rPr>
+          <w:i/>
+          <w:iCs/>
+          <w:vertAlign w:val="subscript"/>
+        </w:rPr>
+        <w:t>1</w:t>
+      </w:r>
+      <w:r>
+        <w:t xml:space="preserve"> =</w:t>
+      </w:r>
+      <w:r>
+        <w:t xml:space="preserve"> </w:t>
+      </w:r>
+      <w:r>
+        <w:t>{</w:t>
+      </w:r>
+      <w:r>
+        <w:t>X</w:t>
+      </w:r>
+      <w:r>
+        <w:t>,</w:t>
+      </w:r>
+      <w:r>
+        <w:t xml:space="preserve"> (¬X </w:t>
+      </w:r>
+      <w:r>
+        <w:rPr>
+          <w:rFonts w:ascii="Cambria Math" w:hAnsi="Cambria Math" w:cs="Cambria Math"/>
+        </w:rPr>
+        <w:t>∨</w:t>
+      </w:r>
+      <w:r>
+        <w:t xml:space="preserve"> Z)</w:t>
+      </w:r>
+      <w:r>
+        <w:t xml:space="preserve">, </w:t>
+      </w:r>
+      <w:r>
+        <w:t xml:space="preserve">(¬Z </w:t>
+      </w:r>
+      <w:r>
+        <w:rPr>
+          <w:rFonts w:ascii="Cambria Math" w:hAnsi="Cambria Math" w:cs="Cambria Math"/>
+        </w:rPr>
+        <w:t>∨</w:t>
+      </w:r>
+      <w:r>
+        <w:t xml:space="preserve"> Y )</w:t>
+      </w:r>
+      <w:r>
+        <w:t xml:space="preserve">, </w:t>
+      </w:r>
+      <w:r>
+        <w:t>¬</w:t>
+      </w:r>
+      <w:r>
+        <w:t>Y</w:t>
+      </w:r>
+      <w:r>
+        <w:t xml:space="preserve">, </w:t>
+      </w:r>
+      <w:r>
+        <w:t>¬</w:t>
+      </w:r>
+      <w:r>
+        <w:t>Z</w:t>
+      </w:r>
+      <w:r>
+        <w:t>}</w:t>
+      </w:r>
+      <w:r>
+        <w:t>,</w:t>
+      </w:r>
+      <w:r>
+        <w:br/>
+      </w:r>
+      <w:r>
+        <w:rPr>
+          <w:i/>
+          <w:iCs/>
+        </w:rPr>
+        <w:t>T</w:t>
+      </w:r>
+      <w:r>
+        <w:rPr>
+          <w:i/>
+          <w:iCs/>
+          <w:vertAlign w:val="subscript"/>
+        </w:rPr>
+        <w:t>2</w:t>
+      </w:r>
+      <w:r>
+        <w:t xml:space="preserve"> = {</w:t>
+      </w:r>
+      <w:r>
+        <w:t>Y</w:t>
+      </w:r>
+      <w:r>
+        <w:t>,</w:t>
+      </w:r>
+      <w:r>
+        <w:t xml:space="preserve"> (¬X </w:t>
+      </w:r>
+      <w:r>
+        <w:rPr>
+          <w:rFonts w:ascii="Cambria Math" w:hAnsi="Cambria Math" w:cs="Cambria Math"/>
+        </w:rPr>
+        <w:t>∨</w:t>
+      </w:r>
+      <w:r>
+        <w:t xml:space="preserve"> Z)</w:t>
+      </w:r>
+      <w:r>
+        <w:t xml:space="preserve">, </w:t>
+      </w:r>
+      <w:r>
+        <w:t xml:space="preserve">(¬Z </w:t>
+      </w:r>
+      <w:r>
+        <w:rPr>
+          <w:rFonts w:ascii="Cambria Math" w:hAnsi="Cambria Math" w:cs="Cambria Math"/>
+        </w:rPr>
+        <w:t>∨</w:t>
+      </w:r>
+      <w:r>
+        <w:t xml:space="preserve"> Y )</w:t>
+      </w:r>
+      <w:r>
+        <w:t xml:space="preserve">, </w:t>
+      </w:r>
+      <w:r>
+        <w:t>¬</w:t>
+      </w:r>
+      <w:r>
+        <w:t>Y</w:t>
+      </w:r>
+      <w:r>
+        <w:t xml:space="preserve">, </w:t>
+      </w:r>
+      <w:r>
+        <w:t>¬</w:t>
+      </w:r>
+      <w:r>
+        <w:t>Z</w:t>
+      </w:r>
+      <w:r>
+        <w:t>}</w:t>
+      </w:r>
+      <w:r>
+        <w:t xml:space="preserve">, which is closed because it contains Y and  </w:t>
+      </w:r>
+      <w:r>
+        <w:t>¬</w:t>
+      </w:r>
+      <w:r>
+        <w:t>Y, and</w:t>
+      </w:r>
+      <w:r>
+        <w:br/>
+      </w:r>
+      <w:r>
+        <w:rPr>
+          <w:i/>
+          <w:iCs/>
+        </w:rPr>
+        <w:t>T</w:t>
+      </w:r>
+      <w:r>
+        <w:rPr>
+          <w:i/>
+          <w:iCs/>
+          <w:vertAlign w:val="subscript"/>
+        </w:rPr>
+        <w:t>3</w:t>
+      </w:r>
+      <w:r>
+        <w:t xml:space="preserve"> = {</w:t>
+      </w:r>
+      <w:r>
+        <w:t>Z</w:t>
+      </w:r>
+      <w:r>
+        <w:t>,</w:t>
+      </w:r>
+      <w:r>
+        <w:t xml:space="preserve"> (¬X </w:t>
+      </w:r>
+      <w:r>
+        <w:rPr>
+          <w:rFonts w:ascii="Cambria Math" w:hAnsi="Cambria Math" w:cs="Cambria Math"/>
+        </w:rPr>
+        <w:t>∨</w:t>
+      </w:r>
+      <w:r>
+        <w:t xml:space="preserve"> Z)</w:t>
+      </w:r>
+      <w:r>
+        <w:t xml:space="preserve">, </w:t>
+      </w:r>
+      <w:r>
+        <w:t xml:space="preserve">(¬Z </w:t>
+      </w:r>
+      <w:r>
+        <w:rPr>
+          <w:rFonts w:ascii="Cambria Math" w:hAnsi="Cambria Math" w:cs="Cambria Math"/>
+        </w:rPr>
+        <w:t>∨</w:t>
+      </w:r>
+      <w:r>
+        <w:t xml:space="preserve"> Y )</w:t>
+      </w:r>
+      <w:r>
+        <w:t xml:space="preserve">, </w:t>
+      </w:r>
+      <w:r>
+        <w:t>¬</w:t>
+      </w:r>
+      <w:r>
+        <w:t>Y</w:t>
+      </w:r>
+      <w:r>
+        <w:t xml:space="preserve">, </w:t>
+      </w:r>
+      <w:r>
+        <w:t>¬</w:t>
+      </w:r>
+      <w:r>
+        <w:t>Z</w:t>
+      </w:r>
+      <w:r>
+        <w:t>}</w:t>
+      </w:r>
+      <w:r>
+        <w:t xml:space="preserve">, which is closed because it contains Z and </w:t>
+      </w:r>
+      <w:r>
+        <w:t>¬</w:t>
+      </w:r>
+      <w:r>
+        <w:t>Z</w:t>
+      </w:r>
+      <w:r>
+        <w:t>.</w:t>
+      </w:r>
+      <w:r>
+        <w:br/>
+        <w:t xml:space="preserve">Because </w:t>
+      </w:r>
+      <w:r>
+        <w:rPr>
+          <w:i/>
+          <w:iCs/>
+        </w:rPr>
+        <w:t>T</w:t>
+      </w:r>
+      <w:r>
+        <w:rPr>
+          <w:i/>
+          <w:iCs/>
+          <w:vertAlign w:val="subscript"/>
+        </w:rPr>
+        <w:t>2</w:t>
+      </w:r>
+      <w:r>
+        <w:t xml:space="preserve"> and </w:t>
+      </w:r>
+      <w:r>
+        <w:rPr>
+          <w:i/>
+          <w:iCs/>
+        </w:rPr>
+        <w:t>T</w:t>
+      </w:r>
+      <w:r>
+        <w:rPr>
+          <w:i/>
+          <w:iCs/>
+          <w:vertAlign w:val="subscript"/>
+        </w:rPr>
+        <w:t>3</w:t>
+      </w:r>
+      <w:r>
+        <w:t xml:space="preserve"> are close, we only need to </w:t>
+      </w:r>
+      <w:r>
+        <w:t xml:space="preserve">get </w:t>
+      </w:r>
+      <w:r>
+        <w:t>branch</w:t>
+      </w:r>
+      <w:r>
+        <w:t>es for</w:t>
+      </w:r>
+      <w:r>
+        <w:t xml:space="preserve"> </w:t>
+      </w:r>
+      <w:r>
+        <w:rPr>
+          <w:i/>
+          <w:iCs/>
+        </w:rPr>
+        <w:t>T</w:t>
+      </w:r>
+      <w:r>
+        <w:rPr>
+          <w:i/>
+          <w:iCs/>
+          <w:vertAlign w:val="subscript"/>
+        </w:rPr>
+        <w:t>1</w:t>
+      </w:r>
+      <w:r>
+        <w:t xml:space="preserve">. </w:t>
+      </w:r>
+      <w:r>
+        <w:t xml:space="preserve">Expanding on </w:t>
+      </w:r>
+      <w:r>
+        <w:t xml:space="preserve">(¬X </w:t>
+      </w:r>
+      <w:r>
+        <w:rPr>
+          <w:rFonts w:ascii="Cambria Math" w:hAnsi="Cambria Math" w:cs="Cambria Math"/>
+        </w:rPr>
+        <w:t>∨</w:t>
+      </w:r>
+      <w:r>
+        <w:t xml:space="preserve"> Z)</w:t>
+      </w:r>
+      <w:r>
+        <w:t xml:space="preserve"> gives:</w:t>
+      </w:r>
+      <w:r>
+        <w:br/>
+      </w:r>
+    </w:p>
+    <w:p>
+      <w:r>
+        <w:rPr>
+          <w:i/>
+          <w:iCs/>
+        </w:rPr>
+        <w:lastRenderedPageBreak/>
+        <w:t>T</w:t>
+      </w:r>
+      <w:r>
+        <w:rPr>
+          <w:i/>
+          <w:iCs/>
+          <w:vertAlign w:val="subscript"/>
+        </w:rPr>
+        <w:t>1</w:t>
+      </w:r>
+      <w:r>
+        <w:rPr>
+          <w:i/>
+          <w:iCs/>
+          <w:vertAlign w:val="subscript"/>
+        </w:rPr>
+        <w:t>a</w:t>
+      </w:r>
+      <w:r>
+        <w:t xml:space="preserve"> = {</w:t>
+      </w:r>
+      <w:r>
+        <w:t>X</w:t>
+      </w:r>
+      <w:r>
+        <w:t>,</w:t>
+      </w:r>
+      <w:r>
+        <w:t xml:space="preserve"> ¬X</w:t>
+      </w:r>
+      <w:r>
+        <w:t xml:space="preserve">, </w:t>
+      </w:r>
+      <w:r>
+        <w:t xml:space="preserve">(¬Z </w:t>
+      </w:r>
+      <w:r>
+        <w:rPr>
+          <w:rFonts w:ascii="Cambria Math" w:hAnsi="Cambria Math" w:cs="Cambria Math"/>
+        </w:rPr>
+        <w:t>∨</w:t>
+      </w:r>
+      <w:r>
+        <w:t xml:space="preserve"> Y )</w:t>
+      </w:r>
+      <w:r>
+        <w:t xml:space="preserve">, </w:t>
+      </w:r>
+      <w:r>
+        <w:t>¬</w:t>
+      </w:r>
+      <w:r>
+        <w:t>Y</w:t>
+      </w:r>
+      <w:r>
+        <w:t xml:space="preserve">, </w:t>
+      </w:r>
+      <w:r>
+        <w:t>¬</w:t>
+      </w:r>
+      <w:r>
+        <w:t>Z</w:t>
+      </w:r>
+      <w:r>
+        <w:t>}</w:t>
+      </w:r>
+      <w:r>
+        <w:t xml:space="preserve">, which </w:t>
+      </w:r>
+      <w:r>
+        <w:t xml:space="preserve">is closed because it contains </w:t>
+      </w:r>
+      <w:r>
+        <w:t>X</w:t>
+      </w:r>
+      <w:r>
+        <w:t xml:space="preserve"> and  </w:t>
+      </w:r>
+      <w:r>
+        <w:t>¬</w:t>
+      </w:r>
+      <w:r>
+        <w:t>X</w:t>
+      </w:r>
+      <w:r>
+        <w:t>, and</w:t>
+      </w:r>
+    </w:p>
+    <w:p>
+      <w:r>
+        <w:rPr>
+          <w:i/>
+          <w:iCs/>
+        </w:rPr>
+        <w:t>T</w:t>
+      </w:r>
+      <w:r>
+        <w:rPr>
+          <w:i/>
+          <w:iCs/>
+          <w:vertAlign w:val="subscript"/>
+        </w:rPr>
+        <w:t>1</w:t>
+      </w:r>
+      <w:r>
+        <w:rPr>
+          <w:i/>
+          <w:iCs/>
+          <w:vertAlign w:val="subscript"/>
+        </w:rPr>
+        <w:t>b</w:t>
+      </w:r>
+      <w:r>
+        <w:t xml:space="preserve"> = {X, Z, (¬Z </w:t>
+      </w:r>
+      <w:r>
+        <w:rPr>
+          <w:rFonts w:ascii="Cambria Math" w:hAnsi="Cambria Math" w:cs="Cambria Math"/>
+        </w:rPr>
+        <w:t>∨</w:t>
+      </w:r>
+      <w:r>
+        <w:t xml:space="preserve"> Y ), ¬Y, ¬Z}</w:t>
+      </w:r>
+      <w:r>
+        <w:t>, which</w:t>
+      </w:r>
+      <w:r>
+        <w:t xml:space="preserve"> </w:t>
+      </w:r>
+      <w:r>
+        <w:t xml:space="preserve">is closed because it contains </w:t>
+      </w:r>
+      <w:r>
+        <w:t>Z</w:t>
+      </w:r>
+      <w:r>
+        <w:t xml:space="preserve"> and  </w:t>
+      </w:r>
+      <w:r>
+        <w:t>¬</w:t>
+      </w:r>
+      <w:r>
+        <w:t xml:space="preserve">Z. Because all branches are closed, the tableau itself is closed. This means </w:t>
+      </w:r>
+      <w:r>
+        <w:t>{</w:t>
+      </w:r>
+      <w:r>
+        <w:t>(</w:t>
+      </w:r>
+      <w:r>
+        <w:t xml:space="preserve">X </w:t>
+      </w:r>
+      <w:r>
+        <w:rPr>
+          <w:rFonts w:ascii="Cambria Math" w:hAnsi="Cambria Math" w:cs="Cambria Math"/>
+        </w:rPr>
+        <w:t>∨</w:t>
+      </w:r>
+      <w:r>
+        <w:t xml:space="preserve"> Y </w:t>
+      </w:r>
+      <w:r>
+        <w:rPr>
+          <w:rFonts w:ascii="Cambria Math" w:hAnsi="Cambria Math" w:cs="Cambria Math"/>
+        </w:rPr>
+        <w:t>∨</w:t>
+      </w:r>
+      <w:r>
+        <w:t xml:space="preserve"> Z) </w:t>
+      </w:r>
+      <w:r>
+        <w:rPr>
+          <w:rFonts w:ascii="Cambria Math" w:hAnsi="Cambria Math" w:cs="Cambria Math"/>
+        </w:rPr>
+        <w:t>∧</w:t>
+      </w:r>
+      <w:r>
+        <w:t xml:space="preserve"> (X → Z) </w:t>
+      </w:r>
+      <w:r>
+        <w:rPr>
+          <w:rFonts w:ascii="Cambria Math" w:hAnsi="Cambria Math" w:cs="Cambria Math"/>
+        </w:rPr>
+        <w:t>∧</w:t>
+      </w:r>
+      <w:r>
+        <w:t xml:space="preserve"> (¬Z </w:t>
+      </w:r>
+      <w:r>
+        <w:rPr>
+          <w:rFonts w:ascii="Cambria Math" w:hAnsi="Cambria Math" w:cs="Cambria Math"/>
+        </w:rPr>
+        <w:t>∨</w:t>
+      </w:r>
+      <w:r>
+        <w:t xml:space="preserve"> Y)} </w:t>
+      </w:r>
+      <w:r>
+        <w:rPr>
+          <w:rFonts w:ascii="Cambria Math" w:hAnsi="Cambria Math" w:cs="Cambria Math"/>
+        </w:rPr>
+        <w:t>∧</w:t>
+      </w:r>
+      <w:r>
+        <w:t xml:space="preserve"> ¬</w:t>
+      </w:r>
+      <w:r>
+        <w:t xml:space="preserve">(Y </w:t>
+      </w:r>
+      <w:r>
+        <w:rPr>
+          <w:rFonts w:ascii="Cambria Math" w:hAnsi="Cambria Math" w:cs="Cambria Math"/>
+        </w:rPr>
+        <w:t>∨</w:t>
+      </w:r>
+      <w:r>
+        <w:t xml:space="preserve"> Z)</w:t>
+      </w:r>
+      <w:r>
+        <w:t xml:space="preserve"> is unsatisfiable</w:t>
+      </w:r>
+      <w:r>
+        <w:t xml:space="preserve"> and </w:t>
+      </w:r>
+      <w:r>
+        <w:t>{</w:t>
+      </w:r>
+      <w:r>
+        <w:t>(</w:t>
+      </w:r>
+      <w:r>
+        <w:t xml:space="preserve">X </w:t>
+      </w:r>
+      <w:r>
+        <w:rPr>
+          <w:rFonts w:ascii="Cambria Math" w:hAnsi="Cambria Math" w:cs="Cambria Math"/>
+        </w:rPr>
+        <w:t>∨</w:t>
+      </w:r>
+      <w:r>
+        <w:t xml:space="preserve"> Y </w:t>
+      </w:r>
+      <w:r>
+        <w:rPr>
+          <w:rFonts w:ascii="Cambria Math" w:hAnsi="Cambria Math" w:cs="Cambria Math"/>
+        </w:rPr>
+        <w:t>∨</w:t>
+      </w:r>
+      <w:r>
+        <w:t xml:space="preserve"> Z) </w:t>
+      </w:r>
+      <w:r>
+        <w:rPr>
+          <w:rFonts w:ascii="Cambria Math" w:hAnsi="Cambria Math" w:cs="Cambria Math"/>
+        </w:rPr>
+        <w:t>∧</w:t>
+      </w:r>
+      <w:r>
+        <w:t xml:space="preserve"> (X → Z) </w:t>
+      </w:r>
+      <w:r>
+        <w:rPr>
+          <w:rFonts w:ascii="Cambria Math" w:hAnsi="Cambria Math" w:cs="Cambria Math"/>
+        </w:rPr>
+        <w:t>∧</w:t>
+      </w:r>
+      <w:r>
+        <w:t xml:space="preserve"> (¬Z </w:t>
+      </w:r>
+      <w:r>
+        <w:rPr>
+          <w:rFonts w:ascii="Cambria Math" w:hAnsi="Cambria Math" w:cs="Cambria Math"/>
+        </w:rPr>
+        <w:t>∨</w:t>
+      </w:r>
+      <w:r>
+        <w:t xml:space="preserve"> Y )} |= (Y </w:t>
+      </w:r>
+      <w:r>
+        <w:rPr>
+          <w:rFonts w:ascii="Cambria Math" w:hAnsi="Cambria Math" w:cs="Cambria Math"/>
+        </w:rPr>
+        <w:t>∨</w:t>
+      </w:r>
+      <w:r>
+        <w:t xml:space="preserve"> Z)</w:t>
+      </w:r>
+      <w:r>
+        <w:t xml:space="preserve"> holds true.</w:t>
+      </w:r>
+    </w:p>
+    <w:p>
+      <w:pPr>
+        <w:rPr>
+          <w:b/>
+          <w:bCs/>
+        </w:rPr>
+      </w:pPr>
+    </w:p>
+    <w:p>
+      <w:r>
+        <w:rPr>
+          <w:b/>
+          <w:bCs/>
+        </w:rPr>
+        <w:t>Exercise 46</w:t>
+      </w:r>
+      <w:r>
+        <w:br/>
+      </w:r>
+      <w:r>
+        <w:t xml:space="preserve">To show </w:t>
+      </w:r>
+      <w:r>
+        <w:t xml:space="preserve">(¬B </w:t>
+      </w:r>
+      <w:r>
+        <w:rPr>
+          <w:rFonts w:ascii="Cambria Math" w:hAnsi="Cambria Math" w:cs="Cambria Math"/>
+        </w:rPr>
+        <w:t>∨</w:t>
+      </w:r>
+      <w:r>
+        <w:t xml:space="preserve"> A) </w:t>
+      </w:r>
+      <w:r>
+        <w:rPr>
+          <w:rFonts w:ascii="Cambria Math" w:hAnsi="Cambria Math" w:cs="Cambria Math"/>
+        </w:rPr>
+        <w:t>∧</w:t>
+      </w:r>
+      <w:r>
+        <w:t xml:space="preserve"> ¬C |= (C → (¬B </w:t>
+      </w:r>
+      <w:r>
+        <w:rPr>
+          <w:rFonts w:ascii="Cambria Math" w:hAnsi="Cambria Math" w:cs="Cambria Math"/>
+        </w:rPr>
+        <w:t>∨</w:t>
+      </w:r>
+      <w:r>
+        <w:t xml:space="preserve"> ¬A))</w:t>
+      </w:r>
+      <w:r>
+        <w:t>, we must show that (</w:t>
+      </w:r>
+      <w:r>
+        <w:t xml:space="preserve">(¬B </w:t>
+      </w:r>
+      <w:r>
+        <w:rPr>
+          <w:rFonts w:ascii="Cambria Math" w:hAnsi="Cambria Math" w:cs="Cambria Math"/>
+        </w:rPr>
+        <w:t>∨</w:t>
+      </w:r>
+      <w:r>
+        <w:t xml:space="preserve"> A) </w:t>
+      </w:r>
+      <w:r>
+        <w:rPr>
+          <w:rFonts w:ascii="Cambria Math" w:hAnsi="Cambria Math" w:cs="Cambria Math"/>
+        </w:rPr>
+        <w:t>∧</w:t>
+      </w:r>
+      <w:r>
+        <w:t xml:space="preserve"> ¬C</w:t>
+      </w:r>
+      <w:r>
+        <w:t>)</w:t>
+      </w:r>
+      <w:r>
+        <w:t xml:space="preserve">  </w:t>
+      </w:r>
+      <w:r>
+        <w:rPr>
+          <w:rFonts w:ascii="Cambria Math" w:hAnsi="Cambria Math" w:cs="Cambria Math"/>
+        </w:rPr>
+        <w:t>∧</w:t>
+      </w:r>
+      <w:r>
+        <w:t xml:space="preserve"> ¬(C → (¬B </w:t>
+      </w:r>
+      <w:r>
+        <w:rPr>
+          <w:rFonts w:ascii="Cambria Math" w:hAnsi="Cambria Math" w:cs="Cambria Math"/>
+        </w:rPr>
+        <w:t>∨</w:t>
+      </w:r>
+      <w:r>
+        <w:t xml:space="preserve"> ¬A))</w:t>
+      </w:r>
+      <w:r>
+        <w:t xml:space="preserve"> is unsatisfiable. This is done by showing that every tableau branch stemming from this is closed, meaning that it contains an atomic formula and its negation. First, we simplify the original expression down to NNF. This results in the expression </w:t>
+      </w:r>
+      <w:r>
+        <w:t xml:space="preserve">(¬B </w:t>
+      </w:r>
+      <w:r>
+        <w:rPr>
+          <w:rFonts w:ascii="Cambria Math" w:hAnsi="Cambria Math" w:cs="Cambria Math"/>
+        </w:rPr>
+        <w:t>∨</w:t>
+      </w:r>
+      <w:r>
+        <w:t xml:space="preserve"> A) </w:t>
+      </w:r>
+      <w:r>
+        <w:rPr>
+          <w:rFonts w:ascii="Cambria Math" w:hAnsi="Cambria Math" w:cs="Cambria Math"/>
+        </w:rPr>
+        <w:t>∧</w:t>
+      </w:r>
+      <w:r>
+        <w:t xml:space="preserve"> ¬C </w:t>
+      </w:r>
+      <w:r>
+        <w:rPr>
+          <w:rFonts w:ascii="Cambria Math" w:hAnsi="Cambria Math" w:cs="Cambria Math"/>
+        </w:rPr>
+        <w:t>∧</w:t>
+      </w:r>
+      <w:r>
+        <w:t xml:space="preserve"> C </w:t>
+      </w:r>
+      <w:r>
+        <w:rPr>
+          <w:rFonts w:ascii="Cambria Math" w:hAnsi="Cambria Math" w:cs="Cambria Math"/>
+        </w:rPr>
+        <w:t>∧</w:t>
+      </w:r>
+      <w:r>
+        <w:t xml:space="preserve"> B </w:t>
+      </w:r>
+      <w:r>
+        <w:rPr>
+          <w:rFonts w:ascii="Cambria Math" w:hAnsi="Cambria Math" w:cs="Cambria Math"/>
+        </w:rPr>
+        <w:t>∧</w:t>
+      </w:r>
+      <w:r>
+        <w:t xml:space="preserve"> A</w:t>
+      </w:r>
+      <w:r>
+        <w:t xml:space="preserve">. From here we get the very first tableau branch, which contains each conjunction of the original expression, </w:t>
+      </w:r>
+      <w:r>
+        <w:rPr>
+          <w:i/>
+          <w:iCs/>
+        </w:rPr>
+        <w:t>T</w:t>
+      </w:r>
+      <w:r>
+        <w:rPr>
+          <w:i/>
+          <w:iCs/>
+          <w:vertAlign w:val="subscript"/>
+        </w:rPr>
+        <w:t>0</w:t>
+      </w:r>
+      <w:r>
+        <w:t xml:space="preserve"> =</w:t>
+      </w:r>
+      <w:r>
+        <w:t xml:space="preserve"> {</w:t>
+      </w:r>
+      <w:r>
+        <w:t xml:space="preserve">(¬B </w:t>
+      </w:r>
+      <w:r>
+        <w:rPr>
+          <w:rFonts w:ascii="Cambria Math" w:hAnsi="Cambria Math" w:cs="Cambria Math"/>
+        </w:rPr>
+        <w:t>∨</w:t>
+      </w:r>
+      <w:r>
+        <w:t xml:space="preserve"> A)</w:t>
+      </w:r>
+      <w:r>
+        <w:t xml:space="preserve">, </w:t>
+      </w:r>
+      <w:r>
+        <w:t>¬C</w:t>
+      </w:r>
+      <w:r>
+        <w:t xml:space="preserve">, </w:t>
+      </w:r>
+      <w:r>
+        <w:t>C</w:t>
+      </w:r>
+      <w:r>
+        <w:t xml:space="preserve">, </w:t>
+      </w:r>
+      <w:r>
+        <w:t>B</w:t>
+      </w:r>
+      <w:r>
+        <w:t xml:space="preserve">, </w:t>
+      </w:r>
+      <w:r>
+        <w:t>A</w:t>
+      </w:r>
+      <w:r>
+        <w:t xml:space="preserve">}. Because this branch has the disjunction </w:t>
+      </w:r>
+      <w:r>
+        <w:t xml:space="preserve">(¬B </w:t>
+      </w:r>
+      <w:r>
+        <w:rPr>
+          <w:rFonts w:ascii="Cambria Math" w:hAnsi="Cambria Math" w:cs="Cambria Math"/>
+        </w:rPr>
+        <w:t>∨</w:t>
+      </w:r>
+      <w:r>
+        <w:t xml:space="preserve"> A)</w:t>
+      </w:r>
+      <w:r>
+        <w:t xml:space="preserve">, it then splits into two branches that each contain one of the elements of the disjunction. Namely, we get </w:t>
+      </w:r>
+      <w:r>
+        <w:rPr>
+          <w:i/>
+          <w:iCs/>
+        </w:rPr>
+        <w:t>T</w:t>
+      </w:r>
+      <w:r>
+        <w:rPr>
+          <w:i/>
+          <w:iCs/>
+          <w:vertAlign w:val="subscript"/>
+        </w:rPr>
+        <w:t>1</w:t>
+      </w:r>
+      <w:r>
+        <w:t xml:space="preserve"> = {</w:t>
+      </w:r>
+      <w:r>
+        <w:t>¬B</w:t>
+      </w:r>
+      <w:r>
+        <w:t>,</w:t>
+      </w:r>
+      <w:r>
+        <w:t xml:space="preserve"> </w:t>
+      </w:r>
+      <w:r>
+        <w:t>¬C</w:t>
+      </w:r>
+      <w:r>
+        <w:t xml:space="preserve">, </w:t>
+      </w:r>
+      <w:r>
+        <w:t>C</w:t>
+      </w:r>
+      <w:r>
+        <w:t xml:space="preserve">, </w:t>
+      </w:r>
+      <w:r>
+        <w:t>B</w:t>
+      </w:r>
+      <w:r>
+        <w:t xml:space="preserve">, </w:t>
+      </w:r>
+      <w:r>
+        <w:t>A</w:t>
+      </w:r>
+      <w:r>
+        <w:t>}</w:t>
+      </w:r>
+      <w:r>
+        <w:t xml:space="preserve"> and </w:t>
+      </w:r>
+      <w:r>
+        <w:rPr>
+          <w:i/>
+          <w:iCs/>
+        </w:rPr>
+        <w:t>T</w:t>
+      </w:r>
+      <w:r>
+        <w:rPr>
+          <w:i/>
+          <w:iCs/>
+          <w:vertAlign w:val="subscript"/>
+        </w:rPr>
+        <w:t>2</w:t>
+      </w:r>
+      <w:r>
+        <w:t xml:space="preserve"> = {</w:t>
+      </w:r>
+      <w:r>
+        <w:t>¬C</w:t>
+      </w:r>
+      <w:r>
+        <w:t xml:space="preserve">, </w:t>
+      </w:r>
+      <w:r>
+        <w:t>C</w:t>
+      </w:r>
+      <w:r>
+        <w:t xml:space="preserve">, </w:t>
+      </w:r>
+      <w:r>
+        <w:t>B</w:t>
+      </w:r>
+      <w:r>
+        <w:t xml:space="preserve">, </w:t>
+      </w:r>
+      <w:r>
+        <w:t>A</w:t>
+      </w:r>
+      <w:r>
+        <w:t>}</w:t>
+      </w:r>
+      <w:r>
+        <w:t xml:space="preserve">. </w:t>
+      </w:r>
+      <w:r>
+        <w:t xml:space="preserve">Now both of these branches are closed because they contain C and </w:t>
+      </w:r>
+      <w:r>
+        <w:t>¬C</w:t>
+      </w:r>
+      <w:r>
+        <w:t xml:space="preserve">. Because we’ve shown that all the tableau branches are closed, then the tableau itself is closed. By theorem 2.6.8, this means that the expression </w:t>
+      </w:r>
+      <w:r>
+        <w:t>(</w:t>
+      </w:r>
+      <w:r>
+        <w:t xml:space="preserve">(¬B </w:t>
+      </w:r>
+      <w:r>
+        <w:rPr>
+          <w:rFonts w:ascii="Cambria Math" w:hAnsi="Cambria Math" w:cs="Cambria Math"/>
+        </w:rPr>
+        <w:t>∨</w:t>
+      </w:r>
+      <w:r>
+        <w:t xml:space="preserve"> A) </w:t>
+      </w:r>
+      <w:r>
+        <w:rPr>
+          <w:rFonts w:ascii="Cambria Math" w:hAnsi="Cambria Math" w:cs="Cambria Math"/>
+        </w:rPr>
+        <w:t>∧</w:t>
+      </w:r>
+      <w:r>
+        <w:t xml:space="preserve"> ¬C</w:t>
+      </w:r>
+      <w:r>
+        <w:t>)</w:t>
+      </w:r>
+      <w:r>
+        <w:t xml:space="preserve">  </w:t>
+      </w:r>
+      <w:r>
+        <w:rPr>
+          <w:rFonts w:ascii="Cambria Math" w:hAnsi="Cambria Math" w:cs="Cambria Math"/>
+        </w:rPr>
+        <w:t>∧</w:t>
+      </w:r>
+      <w:r>
+        <w:t xml:space="preserve"> ¬(C → (¬B </w:t>
+      </w:r>
+      <w:r>
+        <w:rPr>
+          <w:rFonts w:ascii="Cambria Math" w:hAnsi="Cambria Math" w:cs="Cambria Math"/>
+        </w:rPr>
+        <w:t>∨</w:t>
+      </w:r>
+      <w:r>
+        <w:t xml:space="preserve"> ¬A))</w:t>
+      </w:r>
+      <w:r>
+        <w:t xml:space="preserve"> is unsatisfiable, and, thus, </w:t>
+      </w:r>
+      <w:r>
+        <w:t xml:space="preserve">(¬B </w:t>
+      </w:r>
+      <w:r>
+        <w:rPr>
+          <w:rFonts w:ascii="Cambria Math" w:hAnsi="Cambria Math" w:cs="Cambria Math"/>
+        </w:rPr>
+        <w:t>∨</w:t>
+      </w:r>
+      <w:r>
+        <w:t xml:space="preserve"> A) </w:t>
+      </w:r>
+      <w:r>
+        <w:rPr>
+          <w:rFonts w:ascii="Cambria Math" w:hAnsi="Cambria Math" w:cs="Cambria Math"/>
+        </w:rPr>
+        <w:t>∧</w:t>
+      </w:r>
+      <w:r>
+        <w:t xml:space="preserve"> ¬C |= (C → (¬B </w:t>
+      </w:r>
+      <w:r>
+        <w:rPr>
+          <w:rFonts w:ascii="Cambria Math" w:hAnsi="Cambria Math" w:cs="Cambria Math"/>
+        </w:rPr>
+        <w:t>∨</w:t>
+      </w:r>
+      <w:r>
+        <w:t xml:space="preserve"> ¬A))</w:t>
+      </w:r>
+      <w:r>
+        <w:t xml:space="preserve"> holds true.</w:t>
+      </w:r>
+    </w:p>
     <w:sectPr>
       <w:pgSz w:w="12240" w:h="15840"/>
       <w:pgMar w:top="1440" w:right="1440" w:bottom="1440" w:left="1440" w:header="720" w:footer="720" w:gutter="0"/>

</xml_diff>